<commit_message>
Texto legal de la semana: OS 2006-2026-O y 2006-2026-F
Semanal del 18 al 21 de agosto, fin de semana del 15 al 17.
Marcadores {{INDICE}} y {{ANEXOS}} verificados en las dos plantillas.
</commit_message>
<xml_diff>
--- a/plantilla_OS_FINDE.docx
+++ b/plantilla_OS_FINDE.docx
@@ -23,72 +23,138 @@
           <w:sz w:val="26"/>
           <w:szCs w:val="26"/>
         </w:rPr>
-        <w:t>Orden de Servicio de FIN DE SEMANA N° 0XX-2026</w:t>
-      </w:r>
-      <w:commentRangeEnd w:id="0"/>
-      <w:r>
-        <w:commentReference w:id="0"/>
-      </w:r>
-    </w:p>
-    <w:p>
-      <w:pPr>
-        <w:spacing w:after="200" w:line="360" w:lineRule="auto"/>
-        <w:jc w:val="both"/>
-        <w:rPr>
-          <w:rFonts w:ascii="Roboto" w:eastAsia="Roboto" w:hAnsi="Roboto" w:cs="Roboto"/>
-        </w:rPr>
-      </w:pPr>
+        <w:t xml:space="preserve">Orden de Servicio N° </w:t>
+      </w:r>
       <w:r>
         <w:rPr>
           <w:rFonts w:ascii="Roboto" w:eastAsia="Roboto" w:hAnsi="Roboto" w:cs="Roboto"/>
           <w:b/>
           <w:bCs/>
-        </w:rPr>
-        <w:t>Motivo:</w:t>
-      </w:r>
-      <w:r>
-        <w:rPr>
-          <w:rFonts w:ascii="Roboto" w:eastAsia="Roboto" w:hAnsi="Roboto" w:cs="Roboto"/>
-        </w:rPr>
-        <w:t xml:space="preserve"> Establecer el marco operativo para el despliegue de fin de semana del Cuerpo de Agentes de Tránsito, orientado al ordenamiento de la circulación, la prevención de siniestros viales, la fiscalización del cumplimiento de la normativa vigente y la atención a la comunidad durante los turnos de sábado y domingo.</w:t>
-      </w:r>
-    </w:p>
-    <w:p>
-      <w:pPr>
-        <w:spacing w:after="200" w:line="360" w:lineRule="auto"/>
-        <w:jc w:val="both"/>
-        <w:rPr>
-          <w:rFonts w:ascii="Roboto" w:eastAsia="Roboto" w:hAnsi="Roboto" w:cs="Roboto"/>
-        </w:rPr>
-      </w:pPr>
+          <w:sz w:val="26"/>
+          <w:szCs w:val="26"/>
+        </w:rPr>
+        <w:t>2006</w:t>
+      </w:r>
       <w:r>
         <w:rPr>
           <w:rFonts w:ascii="Roboto" w:eastAsia="Roboto" w:hAnsi="Roboto" w:cs="Roboto"/>
           <w:b/>
           <w:bCs/>
-        </w:rPr>
-        <w:t>Fecha:</w:t>
-      </w:r>
-      <w:r>
-        <w:rPr>
-          <w:rFonts w:ascii="Roboto" w:eastAsia="Roboto" w:hAnsi="Roboto" w:cs="Roboto"/>
-        </w:rPr>
-        <w:t xml:space="preserve"> sábado 00 y domingo 00 de Mes de 2026</w:t>
-      </w:r>
-    </w:p>
-    <w:p>
-      <w:pPr>
-        <w:spacing w:after="200" w:line="360" w:lineRule="auto"/>
-        <w:jc w:val="both"/>
-        <w:rPr>
-          <w:rFonts w:ascii="Roboto" w:eastAsia="Roboto" w:hAnsi="Roboto" w:cs="Roboto"/>
-        </w:rPr>
-      </w:pPr>
+          <w:sz w:val="26"/>
+          <w:szCs w:val="26"/>
+        </w:rPr>
+        <w:t>-2026</w:t>
+      </w:r>
+      <w:commentRangeEnd w:id="0"/>
+      <w:r>
+        <w:commentReference w:id="0"/>
+      </w:r>
       <w:r>
         <w:rPr>
           <w:rFonts w:ascii="Roboto" w:eastAsia="Roboto" w:hAnsi="Roboto" w:cs="Roboto"/>
           <w:b/>
           <w:bCs/>
+          <w:sz w:val="26"/>
+          <w:szCs w:val="26"/>
+        </w:rPr>
+        <w:t>-F</w:t>
+      </w:r>
+    </w:p>
+    <w:p>
+      <w:pPr>
+        <w:spacing w:after="200" w:line="360" w:lineRule="auto"/>
+        <w:jc w:val="both"/>
+        <w:rPr>
+          <w:rFonts w:ascii="Roboto" w:eastAsia="Roboto" w:hAnsi="Roboto" w:cs="Roboto"/>
+        </w:rPr>
+      </w:pPr>
+      <w:r>
+        <w:rPr>
+          <w:rFonts w:ascii="Roboto" w:eastAsia="Roboto" w:hAnsi="Roboto" w:cs="Roboto"/>
+          <w:b/>
+          <w:bCs/>
+        </w:rPr>
+        <w:t>Motivo:</w:t>
+      </w:r>
+      <w:r>
+        <w:rPr>
+          <w:rFonts w:ascii="Roboto" w:eastAsia="Roboto" w:hAnsi="Roboto" w:cs="Roboto"/>
+        </w:rPr>
+        <w:t xml:space="preserve"> Establecer el marco operativo para el despliegue de fin de semana del Cuerpo de Agentes de Tránsito, orientado al ordenamiento de la circulación, la prevención de siniestros viales, la fiscalización del cumplimiento de la normativa vigente y la atención a la comunidad durante los </w:t>
+      </w:r>
+      <w:r>
+        <w:rPr>
+          <w:rFonts w:ascii="Roboto" w:eastAsia="Roboto" w:hAnsi="Roboto" w:cs="Roboto"/>
+        </w:rPr>
+        <w:t>fines de semana y feriados.</w:t>
+      </w:r>
+    </w:p>
+    <w:p>
+      <w:pPr>
+        <w:spacing w:after="200" w:line="360" w:lineRule="auto"/>
+        <w:jc w:val="both"/>
+        <w:rPr>
+          <w:rFonts w:ascii="Roboto" w:eastAsia="Roboto" w:hAnsi="Roboto" w:cs="Roboto"/>
+        </w:rPr>
+      </w:pPr>
+      <w:r>
+        <w:rPr>
+          <w:rFonts w:ascii="Roboto" w:eastAsia="Roboto" w:hAnsi="Roboto" w:cs="Roboto"/>
+          <w:b/>
+          <w:bCs/>
+        </w:rPr>
+        <w:t>Fecha:</w:t>
+      </w:r>
+      <w:r>
+        <w:rPr>
+          <w:rFonts w:ascii="Roboto" w:eastAsia="Roboto" w:hAnsi="Roboto" w:cs="Roboto"/>
+        </w:rPr>
+        <w:t xml:space="preserve"> </w:t>
+      </w:r>
+      <w:r>
+        <w:rPr>
+          <w:rFonts w:ascii="Roboto" w:eastAsia="Roboto" w:hAnsi="Roboto" w:cs="Roboto"/>
+        </w:rPr>
+        <w:t xml:space="preserve">desde el </w:t>
+      </w:r>
+      <w:r>
+        <w:rPr>
+          <w:rFonts w:ascii="Roboto" w:eastAsia="Roboto" w:hAnsi="Roboto" w:cs="Roboto"/>
+        </w:rPr>
+        <w:t>15</w:t>
+      </w:r>
+      <w:r>
+        <w:rPr>
+          <w:rFonts w:ascii="Roboto" w:eastAsia="Roboto" w:hAnsi="Roboto" w:cs="Roboto"/>
+        </w:rPr>
+        <w:t xml:space="preserve"> de agosto al </w:t>
+      </w:r>
+      <w:r>
+        <w:rPr>
+          <w:rFonts w:ascii="Roboto" w:eastAsia="Roboto" w:hAnsi="Roboto" w:cs="Roboto"/>
+        </w:rPr>
+        <w:t>17</w:t>
+      </w:r>
+      <w:r>
+        <w:rPr>
+          <w:rFonts w:ascii="Roboto" w:eastAsia="Roboto" w:hAnsi="Roboto" w:cs="Roboto"/>
+        </w:rPr>
+        <w:t xml:space="preserve"> de agosto de 2026</w:t>
+      </w:r>
+    </w:p>
+    <w:p>
+      <w:pPr>
+        <w:spacing w:after="200" w:line="360" w:lineRule="auto"/>
+        <w:jc w:val="both"/>
+        <w:rPr>
+          <w:rFonts w:ascii="Roboto" w:eastAsia="Roboto" w:hAnsi="Roboto" w:cs="Roboto"/>
+        </w:rPr>
+      </w:pPr>
+      <w:r>
+        <w:rPr>
+          <w:rFonts w:ascii="Roboto" w:eastAsia="Roboto" w:hAnsi="Roboto" w:cs="Roboto"/>
+          <w:b/>
+          <w:bCs/>
         </w:rPr>
         <w:t>Alcance:</w:t>
       </w:r>
@@ -96,7 +162,19 @@
         <w:rPr>
           <w:rFonts w:ascii="Roboto" w:eastAsia="Roboto" w:hAnsi="Roboto" w:cs="Roboto"/>
         </w:rPr>
-        <w:t xml:space="preserve"> La presente orden de servicio resulta de aplicación para el personal operativo de las bases operativas del Cuerpo de Agentes de Tránsito afectado a turnos de fin de semana, conforme a la planificación establecida en los anexos que integran la presente.</w:t>
+        <w:t xml:space="preserve"> La presente orden de servicio resulta de aplicación para el personal operativo de las bases operativas del Cuerpo de Agentes de Tránsito afectado a turnos de fin de semana</w:t>
+      </w:r>
+      <w:r>
+        <w:rPr>
+          <w:rFonts w:ascii="Roboto" w:eastAsia="Roboto" w:hAnsi="Roboto" w:cs="Roboto"/>
+        </w:rPr>
+        <w:t xml:space="preserve"> y feriados</w:t>
+      </w:r>
+      <w:r>
+        <w:rPr>
+          <w:rFonts w:ascii="Roboto" w:eastAsia="Roboto" w:hAnsi="Roboto" w:cs="Roboto"/>
+        </w:rPr>
+        <w:t>, conforme a la planificación establecida en los anexos que integran la presente.</w:t>
       </w:r>
     </w:p>
     <w:p>
@@ -583,21 +661,7 @@
         <w:rPr>
           <w:color w:val="000000"/>
         </w:rPr>
-        <w:t xml:space="preserve">- Cambiar </w:t>
-      </w:r>
-      <w:proofErr w:type="spellStart"/>
-      <w:r>
-        <w:rPr>
-          <w:color w:val="000000"/>
-        </w:rPr>
-        <w:t>numeracion</w:t>
-      </w:r>
-      <w:proofErr w:type="spellEnd"/>
-      <w:r>
-        <w:rPr>
-          <w:color w:val="000000"/>
-        </w:rPr>
-        <w:t xml:space="preserve"> del titulo</w:t>
+        <w:t>- Cambiar numeracion del titulo</w:t>
       </w:r>
     </w:p>
     <w:p>
@@ -619,16 +683,8 @@
         <w:rPr>
           <w:color w:val="000000"/>
         </w:rPr>
-        <w:t xml:space="preserve">- Modificar fecha de </w:t>
-      </w:r>
-      <w:proofErr w:type="spellStart"/>
-      <w:r>
-        <w:rPr>
-          <w:color w:val="000000"/>
-        </w:rPr>
-        <w:t>aplicacion</w:t>
-      </w:r>
-      <w:proofErr w:type="spellEnd"/>
+        <w:t>- Modificar fecha de aplicacion</w:t>
+      </w:r>
     </w:p>
     <w:p>
       <w:pPr>
@@ -649,21 +705,7 @@
         <w:rPr>
           <w:color w:val="000000"/>
         </w:rPr>
-        <w:t xml:space="preserve">- Enviar siempre en formato PDF con el nombre ODS_Comunas_002_2026 (o </w:t>
-      </w:r>
-      <w:proofErr w:type="spellStart"/>
-      <w:r>
-        <w:rPr>
-          <w:color w:val="000000"/>
-        </w:rPr>
-        <w:t>numero</w:t>
-      </w:r>
-      <w:proofErr w:type="spellEnd"/>
-      <w:r>
-        <w:rPr>
-          <w:color w:val="000000"/>
-        </w:rPr>
-        <w:t xml:space="preserve"> que corresponda)</w:t>
+        <w:t>- Enviar siempre en formato PDF con el nombre ODS_Comunas_002_2026 (o numero que corresponda)</w:t>
       </w:r>
     </w:p>
   </w:comment>

</xml_diff>